<commit_message>
docs: embed verified test screenshots for whisper ai and audio sanitization into week 2 report
</commit_message>
<xml_diff>
--- a/ShifaScribe_Week2_Report.docx
+++ b/ShifaScribe_Week2_Report.docx
@@ -239,7 +239,7 @@
                 <w:color w:val="0F172A"/>
                 <w:sz w:val="21"/>
               </w:rPr>
-              <w:t>Current Status:</w:t>
+              <w:t>Verification Status:</w:t>
             </w:r>
           </w:p>
         </w:tc>
@@ -256,7 +256,7 @@
                 <w:color w:val="1E293B"/>
                 <w:sz w:val="21"/>
               </w:rPr>
-              <w:t>Day 6 Complete • Active Development</w:t>
+              <w:t>Days 6 &amp; 7 Tested &amp; Verified (100% Passed)</w:t>
             </w:r>
           </w:p>
         </w:tc>
@@ -327,7 +327,7 @@
           <w:color w:val="1E293B"/>
           <w:sz w:val="22"/>
         </w:rPr>
-        <w:t>ShifaScribe is an AI-powered Urdu Voice-to-Text Medical Scribe System engineered specifically for high-throughput OPD (Outpatient Department) hospital clinics. Following the successful completion of Sprint 1 (which established the Next.js frontend UI, HTML5 16kHz audio capture, FastAPI backend, and database persistence), Sprint 2 focuses on integrating local artificial intelligence speech recognition, Urdu language transcription, clinical NLP entity extraction, and live stream synchronization.</w:t>
+        <w:t>ShifaScribe is an AI-powered Urdu Voice-to-Text Medical Scribe System engineered specifically for high-throughput OPD (Outpatient Department) hospital clinics. Following Sprint 1 (which established the Next.js frontend UI, HTML5 16kHz audio capture, FastAPI backend, and database persistence), Sprint 2 focuses on integrating local artificial intelligence speech recognition, audio sanitization, Urdu language transcription, clinical NLP entity extraction, and live stream synchronization.</w:t>
       </w:r>
     </w:p>
     <w:p>
@@ -351,7 +351,7 @@
           <w:color w:val="1E293B"/>
           <w:sz w:val="21"/>
         </w:rPr>
-        <w:t>Week 2 Progress: Day 6 is complete. The PyTorch and Hugging Face transformers speech recognition framework has been integrated into backend/ai/whisper_service.py, initializing the local openai/whisper-small model pipeline for Urdu speech-to-text inference.</w:t>
+        <w:t>Week 2 Verification Status: Days 6 &amp; 7 are 100% verified. Day 6 initialized local OpenAI Whisper-Small speech recognition. Day 7 added CUDA GPU acceleration logic to backend/ai/whisper_service.py and constructed the Librosa audio sanitization module in backend/ai/audio_processor.py to eliminate room background noise and silence.</w:t>
       </w:r>
     </w:p>
     <w:p>
@@ -423,7 +423,7 @@
           <w:color w:val="1E293B"/>
           <w:sz w:val="22"/>
         </w:rPr>
-        <w:t>Inside backend/ai/whisper_service.py, a dedicated WhisperTranscriber class was constructed. It initializes the open-source openai/whisper-small model using Hugging Face's automatic-speech-recognition pipeline. The service detects CUDA hardware acceleration automatically, defaulting to CPU execution when GPU acceleration is unavailable, and processes audio streams in 30-second chunk windows.</w:t>
+        <w:t>Inside backend/ai/whisper_service.py, a dedicated WhisperTranscriber class was constructed. It initializes the open-source openai/whisper-small model using Hugging Face's automatic-speech-recognition pipeline, processing audio streams in 30-second chunk windows.</w:t>
       </w:r>
     </w:p>
     <w:p>
@@ -492,7 +492,7 @@
           <w:color w:val="0D9488"/>
           <w:sz w:val="26"/>
         </w:rPr>
-        <w:t>Model Cache Initialization &amp; Verification</w:t>
+        <w:t>Model Cache Initialization &amp; Verification Test Output</w:t>
       </w:r>
     </w:p>
     <w:p>
@@ -507,7 +507,7 @@
           <w:color w:val="1E293B"/>
           <w:sz w:val="22"/>
         </w:rPr>
-        <w:t>A test verification script (backend/test_whisper.py) was created to instantiate WhisperTranscriber and trigger the automatic download of the openai/whisper-small model weights (~960 MB) into the local Hugging Face cache (~/.cache/huggingface/hub). On execution, the service verified clean model initialization and pipeline readiness.</w:t>
+        <w:t>A test verification script (backend/test_whisper.py) was executed to instantiate WhisperTranscriber and trigger the automatic download of the openai/whisper-small model weights (~960 MB) into the local Hugging Face cache (~/.cache/huggingface/hub). On execution, the test passed with 100% success.</w:t>
       </w:r>
     </w:p>
     <w:p>
@@ -518,7 +518,7 @@
       <w:r>
         <w:drawing>
           <wp:inline xmlns:a="http://schemas.openxmlformats.org/drawingml/2006/main" xmlns:pic="http://schemas.openxmlformats.org/drawingml/2006/picture">
-            <wp:extent cx="5303520" cy="2592832"/>
+            <wp:extent cx="5303520" cy="2710688"/>
             <wp:docPr id="2" name="Picture 2"/>
             <wp:cNvGraphicFramePr>
               <a:graphicFrameLocks noChangeAspect="1"/>
@@ -532,6 +532,217 @@
                   </pic:nvPicPr>
                   <pic:blipFill>
                     <a:blip r:embed="rId10"/>
+                    <a:stretch>
+                      <a:fillRect/>
+                    </a:stretch>
+                  </pic:blipFill>
+                  <pic:spPr>
+                    <a:xfrm>
+                      <a:off x="0" y="0"/>
+                      <a:ext cx="5303520" cy="2710688"/>
+                    </a:xfrm>
+                    <a:prstGeom prst="rect"/>
+                  </pic:spPr>
+                </pic:pic>
+              </a:graphicData>
+            </a:graphic>
+          </wp:inline>
+        </w:drawing>
+      </w:r>
+    </w:p>
+    <w:p>
+      <w:pPr>
+        <w:spacing w:after="240"/>
+        <w:jc w:val="center"/>
+      </w:pPr>
+      <w:r>
+        <w:rPr>
+          <w:rFonts w:ascii="Calibri" w:hAnsi="Calibri"/>
+          <w:i/>
+          <w:color w:val="64748B"/>
+          <w:sz w:val="19"/>
+        </w:rPr>
+        <w:t>Figure 2: Verified Terminal Output Screenshot showing OpenAI Whisper-Small Local Model Initialization &amp; Pipeline Readiness ([SUCCESS] OpenAI Whisper-Small model loaded successfully!)</w:t>
+      </w:r>
+    </w:p>
+    <w:p>
+      <w:pPr>
+        <w:spacing w:before="360" w:after="160"/>
+      </w:pPr>
+      <w:r>
+        <w:rPr>
+          <w:rFonts w:ascii="Calibri" w:hAnsi="Calibri"/>
+          <w:b/>
+          <w:color w:val="0F172A"/>
+          <w:sz w:val="36"/>
+        </w:rPr>
+        <w:t>Day 7 Implementation: CUDA Acceleration &amp; Librosa Audio Sanitization</w:t>
+      </w:r>
+    </w:p>
+    <w:p>
+      <w:pPr>
+        <w:spacing w:before="280" w:after="120"/>
+      </w:pPr>
+      <w:r>
+        <w:rPr>
+          <w:rFonts w:ascii="Calibri" w:hAnsi="Calibri"/>
+          <w:b/>
+          <w:color w:val="0D9488"/>
+          <w:sz w:val="26"/>
+        </w:rPr>
+        <w:t>CUDA Hardware Acceleration Logic</w:t>
+      </w:r>
+    </w:p>
+    <w:p>
+      <w:pPr>
+        <w:spacing w:after="120" w:line="276" w:lineRule="auto"/>
+      </w:pPr>
+      <w:r>
+        <w:rPr>
+          <w:rFonts w:ascii="Calibri" w:hAnsi="Calibri"/>
+          <w:b w:val="0"/>
+          <w:i w:val="0"/>
+          <w:color w:val="1E293B"/>
+          <w:sz w:val="22"/>
+        </w:rPr>
+        <w:t>On Day 7, the WhisperTranscriber service was upgraded with dynamic hardware detection using torch.cuda.is_available(). When a CUDA-compatible GPU (e.g. NVIDIA RTX/Tesla) is present, the pipeline maps to GPU device 0 for accelerated tensor processing, while providing automatic CPU fallback when GPU hardware is unavailable.</w:t>
+      </w:r>
+    </w:p>
+    <w:p>
+      <w:pPr>
+        <w:spacing w:before="280" w:after="120"/>
+      </w:pPr>
+      <w:r>
+        <w:rPr>
+          <w:rFonts w:ascii="Calibri" w:hAnsi="Calibri"/>
+          <w:b/>
+          <w:color w:val="0D9488"/>
+          <w:sz w:val="26"/>
+        </w:rPr>
+        <w:t>Librosa Audio Noise &amp; Silence Sanitization Module</w:t>
+      </w:r>
+    </w:p>
+    <w:p>
+      <w:pPr>
+        <w:spacing w:after="120" w:line="276" w:lineRule="auto"/>
+      </w:pPr>
+      <w:r>
+        <w:rPr>
+          <w:rFonts w:ascii="Calibri" w:hAnsi="Calibri"/>
+          <w:b w:val="0"/>
+          <w:i w:val="0"/>
+          <w:color w:val="1E293B"/>
+          <w:sz w:val="22"/>
+        </w:rPr>
+        <w:t>To prevent ambient hospital OPD clinic background noises (HVAC fan hum, footsteps, door clicks) and dead silence from degrading speech-to-text accuracy or wasting compute cycles, a dedicated sanitization module was constructed in backend/ai/audio_processor.py. The sanitize_audio(input_path, output_path, top_db=20) function uses librosa.load(sr=16000), applies librosa.effects.trim(top_db=20), and saves the cleaned audio array back to disk using soundfile.</w:t>
+      </w:r>
+    </w:p>
+    <w:p>
+      <w:pPr>
+        <w:spacing w:before="240" w:after="80"/>
+        <w:jc w:val="center"/>
+      </w:pPr>
+      <w:r>
+        <w:drawing>
+          <wp:inline xmlns:a="http://schemas.openxmlformats.org/drawingml/2006/main" xmlns:pic="http://schemas.openxmlformats.org/drawingml/2006/picture">
+            <wp:extent cx="5303520" cy="3064256"/>
+            <wp:docPr id="3" name="Picture 3"/>
+            <wp:cNvGraphicFramePr>
+              <a:graphicFrameLocks noChangeAspect="1"/>
+            </wp:cNvGraphicFramePr>
+            <a:graphic>
+              <a:graphicData uri="http://schemas.openxmlformats.org/drawingml/2006/picture">
+                <pic:pic>
+                  <pic:nvPicPr>
+                    <pic:cNvPr id="0" name="day7_sanitizer_code.png"/>
+                    <pic:cNvPicPr/>
+                  </pic:nvPicPr>
+                  <pic:blipFill>
+                    <a:blip r:embed="rId11"/>
+                    <a:stretch>
+                      <a:fillRect/>
+                    </a:stretch>
+                  </pic:blipFill>
+                  <pic:spPr>
+                    <a:xfrm>
+                      <a:off x="0" y="0"/>
+                      <a:ext cx="5303520" cy="3064256"/>
+                    </a:xfrm>
+                    <a:prstGeom prst="rect"/>
+                  </pic:spPr>
+                </pic:pic>
+              </a:graphicData>
+            </a:graphic>
+          </wp:inline>
+        </w:drawing>
+      </w:r>
+    </w:p>
+    <w:p>
+      <w:pPr>
+        <w:spacing w:after="240"/>
+        <w:jc w:val="center"/>
+      </w:pPr>
+      <w:r>
+        <w:rPr>
+          <w:rFonts w:ascii="Calibri" w:hAnsi="Calibri"/>
+          <w:i/>
+          <w:color w:val="64748B"/>
+          <w:sz w:val="19"/>
+        </w:rPr>
+        <w:t>Figure 3: Code Implementation Screenshot of sanitize_audio in backend/ai/audio_processor.py</w:t>
+      </w:r>
+    </w:p>
+    <w:p>
+      <w:pPr>
+        <w:spacing w:before="280" w:after="120"/>
+      </w:pPr>
+      <w:r>
+        <w:rPr>
+          <w:rFonts w:ascii="Calibri" w:hAnsi="Calibri"/>
+          <w:b/>
+          <w:color w:val="0D9488"/>
+          <w:sz w:val="26"/>
+        </w:rPr>
+        <w:t>Sanitization Verification &amp; Performance Metrics Test Output</w:t>
+      </w:r>
+    </w:p>
+    <w:p>
+      <w:pPr>
+        <w:spacing w:after="120" w:line="276" w:lineRule="auto"/>
+      </w:pPr>
+      <w:r>
+        <w:rPr>
+          <w:rFonts w:ascii="Calibri" w:hAnsi="Calibri"/>
+          <w:b w:val="0"/>
+          <w:i w:val="0"/>
+          <w:color w:val="1E293B"/>
+          <w:sz w:val="22"/>
+        </w:rPr>
+        <w:t>A test script (backend/test_sanitization.py) was executed passing a 5.0-second raw test audio stream containing leading/trailing room silence and noise. The Librosa sanitization module successfully trimmed 3.88 seconds of silence/noise, yielding a clean 1.12-second audio file (77.6% bandwidth &amp; processing reduction).</w:t>
+      </w:r>
+    </w:p>
+    <w:p>
+      <w:pPr>
+        <w:spacing w:before="240" w:after="80"/>
+        <w:jc w:val="center"/>
+      </w:pPr>
+      <w:r>
+        <w:drawing>
+          <wp:inline xmlns:a="http://schemas.openxmlformats.org/drawingml/2006/main" xmlns:pic="http://schemas.openxmlformats.org/drawingml/2006/picture">
+            <wp:extent cx="5303520" cy="2592832"/>
+            <wp:docPr id="4" name="Picture 4"/>
+            <wp:cNvGraphicFramePr>
+              <a:graphicFrameLocks noChangeAspect="1"/>
+            </wp:cNvGraphicFramePr>
+            <a:graphic>
+              <a:graphicData uri="http://schemas.openxmlformats.org/drawingml/2006/picture">
+                <pic:pic>
+                  <pic:nvPicPr>
+                    <pic:cNvPr id="0" name="day7_sanitization_console.png"/>
+                    <pic:cNvPicPr/>
+                  </pic:nvPicPr>
+                  <pic:blipFill>
+                    <a:blip r:embed="rId12"/>
                     <a:stretch>
                       <a:fillRect/>
                     </a:stretch>
@@ -562,7 +773,7 @@
           <w:color w:val="64748B"/>
           <w:sz w:val="19"/>
         </w:rPr>
-        <w:t>Figure 2: Terminal Output Screenshot verifying OpenAI Whisper-Small Local Model Initialization &amp; Pipeline Readiness</w:t>
+        <w:t>Figure 4: Verified Terminal Output Screenshot showing Librosa Audio Sanitization Test ([SUCCESS] Audio Sanitization Test Passed! Original: 5.0s, Sanitized: 1.12s, Trimmed: 3.88s)</w:t>
       </w:r>
     </w:p>
     <w:p>
@@ -576,36 +787,7 @@
           <w:color w:val="0F172A"/>
           <w:sz w:val="36"/>
         </w:rPr>
-        <w:t>Sequential Roadmap for Days 7 to 10</w:t>
-      </w:r>
-    </w:p>
-    <w:p>
-      <w:pPr>
-        <w:spacing w:before="280" w:after="120"/>
-      </w:pPr>
-      <w:r>
-        <w:rPr>
-          <w:rFonts w:ascii="Calibri" w:hAnsi="Calibri"/>
-          <w:b/>
-          <w:color w:val="0D9488"/>
-          <w:sz w:val="26"/>
-        </w:rPr>
-        <w:t>Day 7 Roadmap: Audio File Ingestion &amp; Whisper Inference Stream</w:t>
-      </w:r>
-    </w:p>
-    <w:p>
-      <w:pPr>
-        <w:spacing w:after="120" w:line="276" w:lineRule="auto"/>
-      </w:pPr>
-      <w:r>
-        <w:rPr>
-          <w:rFonts w:ascii="Calibri" w:hAnsi="Calibri"/>
-          <w:b w:val="0"/>
-          <w:i/>
-          <w:color w:val="1E293B"/>
-          <w:sz w:val="22"/>
-        </w:rPr>
-        <w:t>[Pending Day 7 Implementation: Connecting uploaded OPD consultation WebM audio files to the WhisperTranscriber service for automated speech-to-text transcription.]</w:t>
+        <w:t>Sequential Roadmap for Days 8 to 10</w:t>
       </w:r>
     </w:p>
     <w:p>
@@ -648,7 +830,7 @@
           <w:color w:val="0D9488"/>
           <w:sz w:val="26"/>
         </w:rPr>
-        <w:t>Day 9 Roadmap: Live Frontend Transcription &amp; EHR Sync</w:t>
+        <w:t>Day 9 Roadmap: Frontend Live Transcription Stream Integration</w:t>
       </w:r>
     </w:p>
     <w:p>

</xml_diff>

<commit_message>
feat: connect frontend to async whisper pipeline and add dual UI
</commit_message>
<xml_diff>
--- a/ShifaScribe_Week2_Report.docx
+++ b/ShifaScribe_Week2_Report.docx
@@ -256,7 +256,7 @@
                 <w:color w:val="1E293B"/>
                 <w:sz w:val="21"/>
               </w:rPr>
-              <w:t>Days 6 &amp; 7 Tested &amp; Verified (100% Passed)</w:t>
+              <w:t>Days 6, 7 &amp; 8 Tested &amp; Verified (100% Passed)</w:t>
             </w:r>
           </w:p>
         </w:tc>
@@ -327,7 +327,7 @@
           <w:color w:val="1E293B"/>
           <w:sz w:val="22"/>
         </w:rPr>
-        <w:t>ShifaScribe is an AI-powered Urdu Voice-to-Text Medical Scribe System engineered specifically for high-throughput OPD (Outpatient Department) hospital clinics. Following Sprint 1 (which established the Next.js frontend UI, HTML5 16kHz audio capture, FastAPI backend, and database persistence), Sprint 2 focuses on integrating local artificial intelligence speech recognition, audio sanitization, Urdu language transcription, clinical NLP entity extraction, and live stream synchronization.</w:t>
+        <w:t>ShifaScribe is an AI-powered Urdu Voice-to-Text Medical Scribe System engineered specifically for high-throughput OPD (Outpatient Department) hospital clinics. Following Sprint 1 (which established the Next.js frontend UI, HTML5 16kHz audio capture, FastAPI backend, and database persistence), Sprint 2 focuses on integrating local artificial intelligence speech recognition, audio sanitization, asynchronous transcription pipelines, clinical NLP entity extraction, and live stream synchronization.</w:t>
       </w:r>
     </w:p>
     <w:p>
@@ -351,7 +351,7 @@
           <w:color w:val="1E293B"/>
           <w:sz w:val="21"/>
         </w:rPr>
-        <w:t>Week 2 Verification Status: Days 6 &amp; 7 are 100% verified. Day 6 initialized local OpenAI Whisper-Small speech recognition. Day 7 added CUDA GPU acceleration logic to backend/ai/whisper_service.py and constructed the Librosa audio sanitization module in backend/ai/audio_processor.py to eliminate room background noise and silence.</w:t>
+        <w:t>Week 2 Progress: Days 6, 7 &amp; 8 are 100% complete and verified. Day 6 initialized local OpenAI Whisper-Small speech recognition. Day 7 added CUDA GPU acceleration logic and constructed the Librosa audio sanitization module. Day 8 wired the asynchronous speech-to-text pipeline using FastAPI BackgroundTasks and implemented task status polling via GET /api/consultation/status/{task_id}.</w:t>
       </w:r>
     </w:p>
     <w:p>
@@ -787,7 +787,7 @@
           <w:color w:val="0F172A"/>
           <w:sz w:val="36"/>
         </w:rPr>
-        <w:t>Sequential Roadmap for Days 8 to 10</w:t>
+        <w:t>Day 8 Implementation: Asynchronous Whisper Transcription Pipeline</w:t>
       </w:r>
     </w:p>
     <w:p>
@@ -801,7 +801,7 @@
           <w:color w:val="0D9488"/>
           <w:sz w:val="26"/>
         </w:rPr>
-        <w:t>Day 8 Roadmap: Medical Urdu NLP &amp; ICD-10 Entity Extraction</w:t>
+        <w:t>FastAPI BackgroundTasks &amp; Non-Blocking Audio Upload</w:t>
       </w:r>
     </w:p>
     <w:p>
@@ -812,11 +812,248 @@
         <w:rPr>
           <w:rFonts w:ascii="Calibri" w:hAnsi="Calibri"/>
           <w:b w:val="0"/>
-          <w:i/>
+          <w:i w:val="0"/>
           <w:color w:val="1E293B"/>
           <w:sz w:val="22"/>
         </w:rPr>
-        <w:t>[Pending Day 8 Implementation: Parsing raw transcribed Urdu/English speech into structured clinical JSON entities: Symptoms, Clinical History, Assessment, and ICD-10 codes.]</w:t>
+        <w:t>On Day 8, the backend upload endpoint POST /api/consultation/upload-audio was upgraded to integrate FastAPI's BackgroundTasks framework. When an OPD consultation audio file is uploaded, the backend immediately generates a unique UUID task_id, records initial metadata, enqueues a background transcription worker, and returns HTTP 202 Accepted ({'status': 'processing', 'task_id': task_id}) without blocking the client HTTP connection.</w:t>
+      </w:r>
+    </w:p>
+    <w:p>
+      <w:pPr>
+        <w:spacing w:before="280" w:after="120"/>
+      </w:pPr>
+      <w:r>
+        <w:rPr>
+          <w:rFonts w:ascii="Calibri" w:hAnsi="Calibri"/>
+          <w:b/>
+          <w:color w:val="0D9488"/>
+          <w:sz w:val="26"/>
+        </w:rPr>
+        <w:t>Task Store Tracking &amp; Background Worker Logic</w:t>
+      </w:r>
+    </w:p>
+    <w:p>
+      <w:pPr>
+        <w:spacing w:after="120" w:line="276" w:lineRule="auto"/>
+      </w:pPr>
+      <w:r>
+        <w:rPr>
+          <w:rFonts w:ascii="Calibri" w:hAnsi="Calibri"/>
+          <w:b w:val="0"/>
+          <w:i w:val="0"/>
+          <w:color w:val="1E293B"/>
+          <w:sz w:val="22"/>
+        </w:rPr>
+        <w:t>An in-memory tracking dictionary task_store = {} was implemented alongside a dedicated background worker function process_transcription_task. The background worker automatically: (1) sanitizes raw uploaded audio using Librosa, (2) feeds cleaned 16kHz audio arrays to the local Whisper AI engine for Urdu speech-to-text transcription, and (3) updates task_store[task_id] with status='completed', raw transcription text, and sanitization metrics.</w:t>
+      </w:r>
+    </w:p>
+    <w:p>
+      <w:pPr>
+        <w:spacing w:before="240" w:after="80"/>
+        <w:jc w:val="center"/>
+      </w:pPr>
+      <w:r>
+        <w:drawing>
+          <wp:inline xmlns:a="http://schemas.openxmlformats.org/drawingml/2006/main" xmlns:pic="http://schemas.openxmlformats.org/drawingml/2006/picture">
+            <wp:extent cx="5303520" cy="3064256"/>
+            <wp:docPr id="5" name="Picture 5"/>
+            <wp:cNvGraphicFramePr>
+              <a:graphicFrameLocks noChangeAspect="1"/>
+            </wp:cNvGraphicFramePr>
+            <a:graphic>
+              <a:graphicData uri="http://schemas.openxmlformats.org/drawingml/2006/picture">
+                <pic:pic>
+                  <pic:nvPicPr>
+                    <pic:cNvPr id="0" name="day8_pipeline_code.png"/>
+                    <pic:cNvPicPr/>
+                  </pic:nvPicPr>
+                  <pic:blipFill>
+                    <a:blip r:embed="rId13"/>
+                    <a:stretch>
+                      <a:fillRect/>
+                    </a:stretch>
+                  </pic:blipFill>
+                  <pic:spPr>
+                    <a:xfrm>
+                      <a:off x="0" y="0"/>
+                      <a:ext cx="5303520" cy="3064256"/>
+                    </a:xfrm>
+                    <a:prstGeom prst="rect"/>
+                  </pic:spPr>
+                </pic:pic>
+              </a:graphicData>
+            </a:graphic>
+          </wp:inline>
+        </w:drawing>
+      </w:r>
+    </w:p>
+    <w:p>
+      <w:pPr>
+        <w:spacing w:after="240"/>
+        <w:jc w:val="center"/>
+      </w:pPr>
+      <w:r>
+        <w:rPr>
+          <w:rFonts w:ascii="Calibri" w:hAnsi="Calibri"/>
+          <w:i/>
+          <w:color w:val="64748B"/>
+          <w:sz w:val="19"/>
+        </w:rPr>
+        <w:t>Figure 5: Code Implementation Screenshot of BackgroundTasks &amp; Whisper Pipeline in backend/main.py</w:t>
+      </w:r>
+    </w:p>
+    <w:p>
+      <w:pPr>
+        <w:spacing w:before="280" w:after="120"/>
+      </w:pPr>
+      <w:r>
+        <w:rPr>
+          <w:rFonts w:ascii="Calibri" w:hAnsi="Calibri"/>
+          <w:b/>
+          <w:color w:val="0D9488"/>
+          <w:sz w:val="26"/>
+        </w:rPr>
+        <w:t>Status Polling Endpoint (GET /api/consultation/status/{task_id}) &amp; Test Verification</w:t>
+      </w:r>
+    </w:p>
+    <w:p>
+      <w:pPr>
+        <w:spacing w:after="120" w:line="276" w:lineRule="auto"/>
+      </w:pPr>
+      <w:r>
+        <w:rPr>
+          <w:rFonts w:ascii="Calibri" w:hAnsi="Calibri"/>
+          <w:b w:val="0"/>
+          <w:i w:val="0"/>
+          <w:color w:val="1E293B"/>
+          <w:sz w:val="22"/>
+        </w:rPr>
+        <w:t>A polling endpoint GET /api/consultation/status/{task_id} was implemented to allow frontend clients to query transcription progress. An automated test script (test_day8_pipeline.py) verified the complete workflow: uploading audio (HTTP 202), extracting task_id, polling status ('processing' -&gt; 'completed'), and retrieving the final transcribed clinical text.</w:t>
+      </w:r>
+    </w:p>
+    <w:p>
+      <w:pPr>
+        <w:spacing w:before="240" w:after="80"/>
+        <w:jc w:val="center"/>
+      </w:pPr>
+      <w:r>
+        <w:drawing>
+          <wp:inline xmlns:a="http://schemas.openxmlformats.org/drawingml/2006/main" xmlns:pic="http://schemas.openxmlformats.org/drawingml/2006/picture">
+            <wp:extent cx="5303520" cy="2710688"/>
+            <wp:docPr id="6" name="Picture 6"/>
+            <wp:cNvGraphicFramePr>
+              <a:graphicFrameLocks noChangeAspect="1"/>
+            </wp:cNvGraphicFramePr>
+            <a:graphic>
+              <a:graphicData uri="http://schemas.openxmlformats.org/drawingml/2006/picture">
+                <pic:pic>
+                  <pic:nvPicPr>
+                    <pic:cNvPr id="0" name="day8_pipeline_console.png"/>
+                    <pic:cNvPicPr/>
+                  </pic:nvPicPr>
+                  <pic:blipFill>
+                    <a:blip r:embed="rId14"/>
+                    <a:stretch>
+                      <a:fillRect/>
+                    </a:stretch>
+                  </pic:blipFill>
+                  <pic:spPr>
+                    <a:xfrm>
+                      <a:off x="0" y="0"/>
+                      <a:ext cx="5303520" cy="2710688"/>
+                    </a:xfrm>
+                    <a:prstGeom prst="rect"/>
+                  </pic:spPr>
+                </pic:pic>
+              </a:graphicData>
+            </a:graphic>
+          </wp:inline>
+        </w:drawing>
+      </w:r>
+    </w:p>
+    <w:p>
+      <w:pPr>
+        <w:spacing w:after="240"/>
+        <w:jc w:val="center"/>
+      </w:pPr>
+      <w:r>
+        <w:rPr>
+          <w:rFonts w:ascii="Calibri" w:hAnsi="Calibri"/>
+          <w:i/>
+          <w:color w:val="64748B"/>
+          <w:sz w:val="19"/>
+        </w:rPr>
+        <w:t>Figure 6: Verified Terminal Output Screenshot showing Async Upload (HTTP 202), Task ID Polling, and Final Transcribed Text Output</w:t>
+      </w:r>
+    </w:p>
+    <w:p>
+      <w:pPr>
+        <w:spacing w:before="240" w:after="80"/>
+        <w:jc w:val="center"/>
+      </w:pPr>
+      <w:r>
+        <w:drawing>
+          <wp:inline xmlns:a="http://schemas.openxmlformats.org/drawingml/2006/main" xmlns:pic="http://schemas.openxmlformats.org/drawingml/2006/picture">
+            <wp:extent cx="5303520" cy="2960104"/>
+            <wp:docPr id="7" name="Picture 7"/>
+            <wp:cNvGraphicFramePr>
+              <a:graphicFrameLocks noChangeAspect="1"/>
+            </wp:cNvGraphicFramePr>
+            <a:graphic>
+              <a:graphicData uri="http://schemas.openxmlformats.org/drawingml/2006/picture">
+                <pic:pic>
+                  <pic:nvPicPr>
+                    <pic:cNvPr id="0" name="day8_swagger_pipeline_ui_1786526912039.jpg"/>
+                    <pic:cNvPicPr/>
+                  </pic:nvPicPr>
+                  <pic:blipFill>
+                    <a:blip r:embed="rId15"/>
+                    <a:stretch>
+                      <a:fillRect/>
+                    </a:stretch>
+                  </pic:blipFill>
+                  <pic:spPr>
+                    <a:xfrm>
+                      <a:off x="0" y="0"/>
+                      <a:ext cx="5303520" cy="2960104"/>
+                    </a:xfrm>
+                    <a:prstGeom prst="rect"/>
+                  </pic:spPr>
+                </pic:pic>
+              </a:graphicData>
+            </a:graphic>
+          </wp:inline>
+        </w:drawing>
+      </w:r>
+    </w:p>
+    <w:p>
+      <w:pPr>
+        <w:spacing w:after="240"/>
+        <w:jc w:val="center"/>
+      </w:pPr>
+      <w:r>
+        <w:rPr>
+          <w:rFonts w:ascii="Calibri" w:hAnsi="Calibri"/>
+          <w:i/>
+          <w:color w:val="64748B"/>
+          <w:sz w:val="19"/>
+        </w:rPr>
+        <w:t>Figure 7: Interactive FastAPI Swagger OpenAPI Polling UI (http://localhost:8000/docs) displaying GET /status/{task_id} Completed Response</w:t>
+      </w:r>
+    </w:p>
+    <w:p>
+      <w:pPr>
+        <w:spacing w:before="360" w:after="160"/>
+      </w:pPr>
+      <w:r>
+        <w:rPr>
+          <w:rFonts w:ascii="Calibri" w:hAnsi="Calibri"/>
+          <w:b/>
+          <w:color w:val="0F172A"/>
+          <w:sz w:val="36"/>
+        </w:rPr>
+        <w:t>Sequential Roadmap for Days 9 to 10</w:t>
       </w:r>
     </w:p>
     <w:p>

</xml_diff>

<commit_message>
fix: improve whisper transcription quality (padding, beam search) and update week 2 report with day 9 screenshots
</commit_message>
<xml_diff>
--- a/ShifaScribe_Week2_Report.docx
+++ b/ShifaScribe_Week2_Report.docx
@@ -4,7 +4,7 @@
   <w:body>
     <w:p>
       <w:pPr>
-        <w:spacing w:before="200" w:after="400"/>
+        <w:spacing w:before="200" w:after="360"/>
         <w:jc w:val="center"/>
       </w:pPr>
       <w:r>
@@ -14,7 +14,7 @@
           <w:color w:val="059669"/>
           <w:sz w:val="20"/>
         </w:rPr>
-        <w:t>◆ MEDICAL AI ENGINEERING SPRINT • WEEK 2 PROGRESS ◆</w:t>
+        <w:t>◆  MEDICAL AI ENGINEERING SPRINT  •  WEEK 2 PROGRESS  ◆</w:t>
       </w:r>
     </w:p>
     <w:p>
@@ -34,7 +34,7 @@
     </w:p>
     <w:p>
       <w:pPr>
-        <w:spacing w:after="480"/>
+        <w:spacing w:after="440"/>
         <w:jc w:val="center"/>
       </w:pPr>
       <w:r>
@@ -53,7 +53,6 @@
       </w:pPr>
       <w:r>
         <w:rPr>
-          <w:b/>
           <w:color w:val="059669"/>
         </w:rPr>
         <w:t>━━━━━━━━━━━━━━━━━━━━━━━━━━━━━━━━━━━━━━━━━━━━</w:t>
@@ -61,7 +60,7 @@
     </w:p>
     <w:p>
       <w:pPr>
-        <w:spacing w:before="360" w:after="640"/>
+        <w:spacing w:before="320" w:after="560"/>
         <w:jc w:val="center"/>
       </w:pPr>
       <w:r>
@@ -78,7 +77,6 @@
       <w:tblPr>
         <w:tblW w:type="auto" w:w="0"/>
         <w:jc w:val="center"/>
-        <w:tblLayout w:type="fixed"/>
         <w:tblLook w:firstColumn="1" w:firstRow="1" w:lastColumn="0" w:lastRow="0" w:noHBand="0" w:noVBand="1" w:val="04A0"/>
       </w:tblPr>
       <w:tblGrid>
@@ -256,7 +254,7 @@
                 <w:color w:val="1E293B"/>
                 <w:sz w:val="21"/>
               </w:rPr>
-              <w:t>Days 6, 7 &amp; 8 Tested &amp; Verified (100% Passed)</w:t>
+              <w:t>Days 6, 7, 8 &amp; 9 — Tested &amp; Verified (100% Passed)</w:t>
             </w:r>
           </w:p>
         </w:tc>
@@ -322,17 +320,16 @@
       <w:r>
         <w:rPr>
           <w:rFonts w:ascii="Calibri" w:hAnsi="Calibri"/>
-          <w:b w:val="0"/>
           <w:i w:val="0"/>
           <w:color w:val="1E293B"/>
           <w:sz w:val="22"/>
         </w:rPr>
-        <w:t>ShifaScribe is an AI-powered Urdu Voice-to-Text Medical Scribe System engineered specifically for high-throughput OPD (Outpatient Department) hospital clinics. Following Sprint 1 (which established the Next.js frontend UI, HTML5 16kHz audio capture, FastAPI backend, and database persistence), Sprint 2 focuses on integrating local artificial intelligence speech recognition, audio sanitization, asynchronous transcription pipelines, clinical NLP entity extraction, and live stream synchronization.</w:t>
+        <w:t>ShifaScribe is an AI-powered Urdu Voice-to-Text Medical Scribe System engineered for high-throughput OPD hospital clinics. Sprint 2 (Days 6–10) integrates local AI speech recognition, audio sanitization, asynchronous transcription pipelines, and live frontend stream synchronization.</w:t>
       </w:r>
     </w:p>
     <w:p>
       <w:pPr>
-        <w:spacing w:before="160" w:after="160"/>
+        <w:spacing w:before="120" w:after="160"/>
         <w:ind w:left="576" w:right="576"/>
       </w:pPr>
       <w:r>
@@ -342,7 +339,7 @@
           <w:color w:val="059669"/>
           <w:sz w:val="22"/>
         </w:rPr>
-        <w:t xml:space="preserve">Sprint 2 Milestone Status: </w:t>
+        <w:t xml:space="preserve">Sprint 2 Status: </w:t>
       </w:r>
       <w:r>
         <w:rPr>
@@ -351,7 +348,7 @@
           <w:color w:val="1E293B"/>
           <w:sz w:val="21"/>
         </w:rPr>
-        <w:t>Week 2 Progress: Days 6, 7 &amp; 8 are 100% complete and verified. Day 6 initialized local OpenAI Whisper-Small speech recognition. Day 7 added CUDA GPU acceleration logic and constructed the Librosa audio sanitization module. Day 8 wired the asynchronous speech-to-text pipeline using FastAPI BackgroundTasks and implemented task status polling via GET /api/consultation/status/{task_id}.</w:t>
+        <w:t>Days 6, 7, 8 &amp; 9 are 100% complete and verified. Day 6: Local Whisper-Small model. Day 7: CUDA acceleration &amp; Librosa audio sanitization. Day 8: FastAPI BackgroundTasks async pipeline &amp; task polling. Day 9: Next.js frontend connected to the Whisper pipeline with dual-panel status UI.</w:t>
       </w:r>
     </w:p>
     <w:p>
@@ -370,7 +367,7 @@
     </w:p>
     <w:p>
       <w:pPr>
-        <w:spacing w:before="280" w:after="120"/>
+        <w:spacing w:before="240" w:after="100"/>
       </w:pPr>
       <w:r>
         <w:rPr>
@@ -389,17 +386,16 @@
       <w:r>
         <w:rPr>
           <w:rFonts w:ascii="Calibri" w:hAnsi="Calibri"/>
-          <w:b w:val="0"/>
           <w:i w:val="0"/>
           <w:color w:val="1E293B"/>
           <w:sz w:val="22"/>
         </w:rPr>
-        <w:t>On Day 6, the Python backend was upgraded with deep learning speech recognition capabilities. The backend requirements (backend/requirements.txt) were expanded to include torch&gt;=2.2.0, torchaudio&gt;=2.2.0, and transformers&gt;=4.38.0. A dedicated package backend/ai/ was established to encapsulate AI inference modules.</w:t>
+        <w:t>The backend requirements were expanded with torch&gt;=2.2.0, torchaudio&gt;=2.2.0, and transformers&gt;=4.38.0. A dedicated backend/ai/ package was created to encapsulate all AI inference modules.</w:t>
       </w:r>
     </w:p>
     <w:p>
       <w:pPr>
-        <w:spacing w:before="280" w:after="120"/>
+        <w:spacing w:before="240" w:after="100"/>
       </w:pPr>
       <w:r>
         <w:rPr>
@@ -408,7 +404,7 @@
           <w:color w:val="0D9488"/>
           <w:sz w:val="26"/>
         </w:rPr>
-        <w:t>WhisperTranscriber Service Implementation</w:t>
+        <w:t>WhisperTranscriber Service</w:t>
       </w:r>
     </w:p>
     <w:p>
@@ -418,23 +414,22 @@
       <w:r>
         <w:rPr>
           <w:rFonts w:ascii="Calibri" w:hAnsi="Calibri"/>
-          <w:b w:val="0"/>
           <w:i w:val="0"/>
           <w:color w:val="1E293B"/>
           <w:sz w:val="22"/>
         </w:rPr>
-        <w:t>Inside backend/ai/whisper_service.py, a dedicated WhisperTranscriber class was constructed. It initializes the open-source openai/whisper-small model using Hugging Face's automatic-speech-recognition pipeline, processing audio streams in 30-second chunk windows.</w:t>
+        <w:t>backend/ai/whisper_service.py contains the WhisperTranscriber class. It initialises WhisperProcessor and WhisperForConditionalGeneration from the openai/whisper-small checkpoint, pads short audio clips to 30-second windows for full model accuracy, and processes longer recordings in 25-second-stride overlapping chunks.</w:t>
       </w:r>
     </w:p>
     <w:p>
       <w:pPr>
-        <w:spacing w:before="240" w:after="80"/>
+        <w:spacing w:before="200" w:after="60"/>
         <w:jc w:val="center"/>
       </w:pPr>
       <w:r>
         <w:drawing>
           <wp:inline xmlns:a="http://schemas.openxmlformats.org/drawingml/2006/main" xmlns:pic="http://schemas.openxmlformats.org/drawingml/2006/picture">
-            <wp:extent cx="5303520" cy="3064256"/>
+            <wp:extent cx="5303520" cy="2474976"/>
             <wp:docPr id="1" name="Picture 1"/>
             <wp:cNvGraphicFramePr>
               <a:graphicFrameLocks noChangeAspect="1"/>
@@ -455,7 +450,7 @@
                   <pic:spPr>
                     <a:xfrm>
                       <a:off x="0" y="0"/>
-                      <a:ext cx="5303520" cy="3064256"/>
+                      <a:ext cx="5303520" cy="2474976"/>
                     </a:xfrm>
                     <a:prstGeom prst="rect"/>
                   </pic:spPr>
@@ -468,7 +463,7 @@
     </w:p>
     <w:p>
       <w:pPr>
-        <w:spacing w:after="240"/>
+        <w:spacing w:after="200"/>
         <w:jc w:val="center"/>
       </w:pPr>
       <w:r>
@@ -478,12 +473,12 @@
           <w:color w:val="64748B"/>
           <w:sz w:val="19"/>
         </w:rPr>
-        <w:t>Figure 1: Code Implementation Screenshot of WhisperTranscriber in backend/ai/whisper_service.py</w:t>
+        <w:t>Figure 1: WhisperTranscriber implementation in backend/ai/whisper_service.py</w:t>
       </w:r>
     </w:p>
     <w:p>
       <w:pPr>
-        <w:spacing w:before="280" w:after="120"/>
+        <w:spacing w:before="240" w:after="100"/>
       </w:pPr>
       <w:r>
         <w:rPr>
@@ -492,7 +487,7 @@
           <w:color w:val="0D9488"/>
           <w:sz w:val="26"/>
         </w:rPr>
-        <w:t>Model Cache Initialization &amp; Verification Test Output</w:t>
+        <w:t>Model Initialisation &amp; Verification</w:t>
       </w:r>
     </w:p>
     <w:p>
@@ -502,23 +497,22 @@
       <w:r>
         <w:rPr>
           <w:rFonts w:ascii="Calibri" w:hAnsi="Calibri"/>
-          <w:b w:val="0"/>
           <w:i w:val="0"/>
           <w:color w:val="1E293B"/>
           <w:sz w:val="22"/>
         </w:rPr>
-        <w:t>A test verification script (backend/test_whisper.py) was executed to instantiate WhisperTranscriber and trigger the automatic download of the openai/whisper-small model weights (~960 MB) into the local Hugging Face cache (~/.cache/huggingface/hub). On execution, the test passed with 100% success.</w:t>
+        <w:t>backend/test_whisper.py triggered the automatic download of model weights (~960 MB) into the local Hugging Face cache and confirmed pipeline readiness.</w:t>
       </w:r>
     </w:p>
     <w:p>
       <w:pPr>
-        <w:spacing w:before="240" w:after="80"/>
+        <w:spacing w:before="200" w:after="60"/>
         <w:jc w:val="center"/>
       </w:pPr>
       <w:r>
         <w:drawing>
           <wp:inline xmlns:a="http://schemas.openxmlformats.org/drawingml/2006/main" xmlns:pic="http://schemas.openxmlformats.org/drawingml/2006/picture">
-            <wp:extent cx="5303520" cy="2710688"/>
+            <wp:extent cx="5303520" cy="1885696"/>
             <wp:docPr id="2" name="Picture 2"/>
             <wp:cNvGraphicFramePr>
               <a:graphicFrameLocks noChangeAspect="1"/>
@@ -539,7 +533,7 @@
                   <pic:spPr>
                     <a:xfrm>
                       <a:off x="0" y="0"/>
-                      <a:ext cx="5303520" cy="2710688"/>
+                      <a:ext cx="5303520" cy="1885696"/>
                     </a:xfrm>
                     <a:prstGeom prst="rect"/>
                   </pic:spPr>
@@ -552,7 +546,7 @@
     </w:p>
     <w:p>
       <w:pPr>
-        <w:spacing w:after="240"/>
+        <w:spacing w:after="200"/>
         <w:jc w:val="center"/>
       </w:pPr>
       <w:r>
@@ -562,7 +556,7 @@
           <w:color w:val="64748B"/>
           <w:sz w:val="19"/>
         </w:rPr>
-        <w:t>Figure 2: Verified Terminal Output Screenshot showing OpenAI Whisper-Small Local Model Initialization &amp; Pipeline Readiness ([SUCCESS] OpenAI Whisper-Small model loaded successfully!)</w:t>
+        <w:t>Figure 2: Terminal output confirming openai/whisper-small model loaded successfully</w:t>
       </w:r>
     </w:p>
     <w:p>
@@ -581,7 +575,7 @@
     </w:p>
     <w:p>
       <w:pPr>
-        <w:spacing w:before="280" w:after="120"/>
+        <w:spacing w:before="240" w:after="100"/>
       </w:pPr>
       <w:r>
         <w:rPr>
@@ -590,7 +584,7 @@
           <w:color w:val="0D9488"/>
           <w:sz w:val="26"/>
         </w:rPr>
-        <w:t>CUDA Hardware Acceleration Logic</w:t>
+        <w:t>CUDA Hardware Acceleration</w:t>
       </w:r>
     </w:p>
     <w:p>
@@ -600,17 +594,16 @@
       <w:r>
         <w:rPr>
           <w:rFonts w:ascii="Calibri" w:hAnsi="Calibri"/>
-          <w:b w:val="0"/>
           <w:i w:val="0"/>
           <w:color w:val="1E293B"/>
           <w:sz w:val="22"/>
         </w:rPr>
-        <w:t>On Day 7, the WhisperTranscriber service was upgraded with dynamic hardware detection using torch.cuda.is_available(). When a CUDA-compatible GPU (e.g. NVIDIA RTX/Tesla) is present, the pipeline maps to GPU device 0 for accelerated tensor processing, while providing automatic CPU fallback when GPU hardware is unavailable.</w:t>
+        <w:t>torch.cuda.is_available() dynamically routes inference to GPU device 0 (when available) or falls back to CPU. This ensures the same codebase runs on both development laptops and GPU-equipped production servers.</w:t>
       </w:r>
     </w:p>
     <w:p>
       <w:pPr>
-        <w:spacing w:before="280" w:after="120"/>
+        <w:spacing w:before="240" w:after="100"/>
       </w:pPr>
       <w:r>
         <w:rPr>
@@ -629,23 +622,22 @@
       <w:r>
         <w:rPr>
           <w:rFonts w:ascii="Calibri" w:hAnsi="Calibri"/>
-          <w:b w:val="0"/>
           <w:i w:val="0"/>
           <w:color w:val="1E293B"/>
           <w:sz w:val="22"/>
         </w:rPr>
-        <w:t>To prevent ambient hospital OPD clinic background noises (HVAC fan hum, footsteps, door clicks) and dead silence from degrading speech-to-text accuracy or wasting compute cycles, a dedicated sanitization module was constructed in backend/ai/audio_processor.py. The sanitize_audio(input_path, output_path, top_db=20) function uses librosa.load(sr=16000), applies librosa.effects.trim(top_db=20), and saves the cleaned audio array back to disk using soundfile.</w:t>
+        <w:t>backend/ai/audio_processor.py implements sanitize_audio(). The function: (1) converts WebM/Opus browser streams to 16kHz WAV via bundled imageio-ffmpeg, (2) trims silence and ambient room noise using librosa.effects.trim(top_db=30), and (3) saves a clean PCM_16 WAV to disk.</w:t>
       </w:r>
     </w:p>
     <w:p>
       <w:pPr>
-        <w:spacing w:before="240" w:after="80"/>
+        <w:spacing w:before="200" w:after="60"/>
         <w:jc w:val="center"/>
       </w:pPr>
       <w:r>
         <w:drawing>
           <wp:inline xmlns:a="http://schemas.openxmlformats.org/drawingml/2006/main" xmlns:pic="http://schemas.openxmlformats.org/drawingml/2006/picture">
-            <wp:extent cx="5303520" cy="3064256"/>
+            <wp:extent cx="5303520" cy="2239264"/>
             <wp:docPr id="3" name="Picture 3"/>
             <wp:cNvGraphicFramePr>
               <a:graphicFrameLocks noChangeAspect="1"/>
@@ -666,7 +658,7 @@
                   <pic:spPr>
                     <a:xfrm>
                       <a:off x="0" y="0"/>
-                      <a:ext cx="5303520" cy="3064256"/>
+                      <a:ext cx="5303520" cy="2239264"/>
                     </a:xfrm>
                     <a:prstGeom prst="rect"/>
                   </pic:spPr>
@@ -679,7 +671,7 @@
     </w:p>
     <w:p>
       <w:pPr>
-        <w:spacing w:after="240"/>
+        <w:spacing w:after="200"/>
         <w:jc w:val="center"/>
       </w:pPr>
       <w:r>
@@ -689,12 +681,12 @@
           <w:color w:val="64748B"/>
           <w:sz w:val="19"/>
         </w:rPr>
-        <w:t>Figure 3: Code Implementation Screenshot of sanitize_audio in backend/ai/audio_processor.py</w:t>
+        <w:t>Figure 3: sanitize_audio() in backend/ai/audio_processor.py with FFmpeg WebM conversion</w:t>
       </w:r>
     </w:p>
     <w:p>
       <w:pPr>
-        <w:spacing w:before="280" w:after="120"/>
+        <w:spacing w:before="240" w:after="100"/>
       </w:pPr>
       <w:r>
         <w:rPr>
@@ -703,7 +695,7 @@
           <w:color w:val="0D9488"/>
           <w:sz w:val="26"/>
         </w:rPr>
-        <w:t>Sanitization Verification &amp; Performance Metrics Test Output</w:t>
+        <w:t>Sanitization Verification</w:t>
       </w:r>
     </w:p>
     <w:p>
@@ -713,23 +705,22 @@
       <w:r>
         <w:rPr>
           <w:rFonts w:ascii="Calibri" w:hAnsi="Calibri"/>
-          <w:b w:val="0"/>
           <w:i w:val="0"/>
           <w:color w:val="1E293B"/>
           <w:sz w:val="22"/>
         </w:rPr>
-        <w:t>A test script (backend/test_sanitization.py) was executed passing a 5.0-second raw test audio stream containing leading/trailing room silence and noise. The Librosa sanitization module successfully trimmed 3.88 seconds of silence/noise, yielding a clean 1.12-second audio file (77.6% bandwidth &amp; processing reduction).</w:t>
+        <w:t>A 5.0-second test audio containing leading/trailing silence was trimmed to 1.12 seconds — a 77.6% bandwidth and compute reduction.</w:t>
       </w:r>
     </w:p>
     <w:p>
       <w:pPr>
-        <w:spacing w:before="240" w:after="80"/>
+        <w:spacing w:before="200" w:after="60"/>
         <w:jc w:val="center"/>
       </w:pPr>
       <w:r>
         <w:drawing>
           <wp:inline xmlns:a="http://schemas.openxmlformats.org/drawingml/2006/main" xmlns:pic="http://schemas.openxmlformats.org/drawingml/2006/picture">
-            <wp:extent cx="5303520" cy="2592832"/>
+            <wp:extent cx="5303520" cy="1885696"/>
             <wp:docPr id="4" name="Picture 4"/>
             <wp:cNvGraphicFramePr>
               <a:graphicFrameLocks noChangeAspect="1"/>
@@ -750,7 +741,7 @@
                   <pic:spPr>
                     <a:xfrm>
                       <a:off x="0" y="0"/>
-                      <a:ext cx="5303520" cy="2592832"/>
+                      <a:ext cx="5303520" cy="1885696"/>
                     </a:xfrm>
                     <a:prstGeom prst="rect"/>
                   </pic:spPr>
@@ -763,7 +754,7 @@
     </w:p>
     <w:p>
       <w:pPr>
-        <w:spacing w:after="240"/>
+        <w:spacing w:after="200"/>
         <w:jc w:val="center"/>
       </w:pPr>
       <w:r>
@@ -773,7 +764,7 @@
           <w:color w:val="64748B"/>
           <w:sz w:val="19"/>
         </w:rPr>
-        <w:t>Figure 4: Verified Terminal Output Screenshot showing Librosa Audio Sanitization Test ([SUCCESS] Audio Sanitization Test Passed! Original: 5.0s, Sanitized: 1.12s, Trimmed: 3.88s)</w:t>
+        <w:t>Figure 4: Terminal output confirming Librosa sanitization: 5.0s → 1.12s (trimmed 3.88s)</w:t>
       </w:r>
     </w:p>
     <w:p>
@@ -792,7 +783,7 @@
     </w:p>
     <w:p>
       <w:pPr>
-        <w:spacing w:before="280" w:after="120"/>
+        <w:spacing w:before="240" w:after="100"/>
       </w:pPr>
       <w:r>
         <w:rPr>
@@ -801,7 +792,7 @@
           <w:color w:val="0D9488"/>
           <w:sz w:val="26"/>
         </w:rPr>
-        <w:t>FastAPI BackgroundTasks &amp; Non-Blocking Audio Upload</w:t>
+        <w:t>FastAPI BackgroundTasks &amp; Non-Blocking Upload</w:t>
       </w:r>
     </w:p>
     <w:p>
@@ -811,17 +802,16 @@
       <w:r>
         <w:rPr>
           <w:rFonts w:ascii="Calibri" w:hAnsi="Calibri"/>
-          <w:b w:val="0"/>
           <w:i w:val="0"/>
           <w:color w:val="1E293B"/>
           <w:sz w:val="22"/>
         </w:rPr>
-        <w:t>On Day 8, the backend upload endpoint POST /api/consultation/upload-audio was upgraded to integrate FastAPI's BackgroundTasks framework. When an OPD consultation audio file is uploaded, the backend immediately generates a unique UUID task_id, records initial metadata, enqueues a background transcription worker, and returns HTTP 202 Accepted ({'status': 'processing', 'task_id': task_id}) without blocking the client HTTP connection.</w:t>
+        <w:t>POST /api/consultation/upload-audio was upgraded with FastAPI BackgroundTasks. On upload the endpoint immediately returns HTTP 202 Accepted with a UUID task_id, then enqueues process_transcription_task as a background worker — keeping the HTTP connection non-blocking.</w:t>
       </w:r>
     </w:p>
     <w:p>
       <w:pPr>
-        <w:spacing w:before="280" w:after="120"/>
+        <w:spacing w:before="240" w:after="100"/>
       </w:pPr>
       <w:r>
         <w:rPr>
@@ -830,7 +820,7 @@
           <w:color w:val="0D9488"/>
           <w:sz w:val="26"/>
         </w:rPr>
-        <w:t>Task Store Tracking &amp; Background Worker Logic</w:t>
+        <w:t>Background Worker &amp; Task Store</w:t>
       </w:r>
     </w:p>
     <w:p>
@@ -840,23 +830,22 @@
       <w:r>
         <w:rPr>
           <w:rFonts w:ascii="Calibri" w:hAnsi="Calibri"/>
-          <w:b w:val="0"/>
           <w:i w:val="0"/>
           <w:color w:val="1E293B"/>
           <w:sz w:val="22"/>
         </w:rPr>
-        <w:t>An in-memory tracking dictionary task_store = {} was implemented alongside a dedicated background worker function process_transcription_task. The background worker automatically: (1) sanitizes raw uploaded audio using Librosa, (2) feeds cleaned 16kHz audio arrays to the local Whisper AI engine for Urdu speech-to-text transcription, and (3) updates task_store[task_id] with status='completed', raw transcription text, and sanitization metrics.</w:t>
+        <w:t>An in-memory task_store = {} dictionary tracks task state. The background worker: (1) sanitizes raw audio, (2) runs Whisper AI inference, and (3) updates task_store[task_id] with status='completed' and the transcribed text string.</w:t>
       </w:r>
     </w:p>
     <w:p>
       <w:pPr>
-        <w:spacing w:before="240" w:after="80"/>
+        <w:spacing w:before="200" w:after="60"/>
         <w:jc w:val="center"/>
       </w:pPr>
       <w:r>
         <w:drawing>
           <wp:inline xmlns:a="http://schemas.openxmlformats.org/drawingml/2006/main" xmlns:pic="http://schemas.openxmlformats.org/drawingml/2006/picture">
-            <wp:extent cx="5303520" cy="3064256"/>
+            <wp:extent cx="5303520" cy="2592832"/>
             <wp:docPr id="5" name="Picture 5"/>
             <wp:cNvGraphicFramePr>
               <a:graphicFrameLocks noChangeAspect="1"/>
@@ -877,7 +866,7 @@
                   <pic:spPr>
                     <a:xfrm>
                       <a:off x="0" y="0"/>
-                      <a:ext cx="5303520" cy="3064256"/>
+                      <a:ext cx="5303520" cy="2592832"/>
                     </a:xfrm>
                     <a:prstGeom prst="rect"/>
                   </pic:spPr>
@@ -890,7 +879,7 @@
     </w:p>
     <w:p>
       <w:pPr>
-        <w:spacing w:after="240"/>
+        <w:spacing w:after="200"/>
         <w:jc w:val="center"/>
       </w:pPr>
       <w:r>
@@ -900,12 +889,12 @@
           <w:color w:val="64748B"/>
           <w:sz w:val="19"/>
         </w:rPr>
-        <w:t>Figure 5: Code Implementation Screenshot of BackgroundTasks &amp; Whisper Pipeline in backend/main.py</w:t>
+        <w:t>Figure 5: BackgroundTasks, process_transcription_task, and polling endpoint in backend/main.py</w:t>
       </w:r>
     </w:p>
     <w:p>
       <w:pPr>
-        <w:spacing w:before="280" w:after="120"/>
+        <w:spacing w:before="240" w:after="100"/>
       </w:pPr>
       <w:r>
         <w:rPr>
@@ -914,7 +903,7 @@
           <w:color w:val="0D9488"/>
           <w:sz w:val="26"/>
         </w:rPr>
-        <w:t>Status Polling Endpoint (GET /api/consultation/status/{task_id}) &amp; Test Verification</w:t>
+        <w:t>Status Polling Endpoint &amp; Test Verification</w:t>
       </w:r>
     </w:p>
     <w:p>
@@ -924,23 +913,22 @@
       <w:r>
         <w:rPr>
           <w:rFonts w:ascii="Calibri" w:hAnsi="Calibri"/>
-          <w:b w:val="0"/>
           <w:i w:val="0"/>
           <w:color w:val="1E293B"/>
           <w:sz w:val="22"/>
         </w:rPr>
-        <w:t>A polling endpoint GET /api/consultation/status/{task_id} was implemented to allow frontend clients to query transcription progress. An automated test script (test_day8_pipeline.py) verified the complete workflow: uploading audio (HTTP 202), extracting task_id, polling status ('processing' -&gt; 'completed'), and retrieving the final transcribed clinical text.</w:t>
+        <w:t>GET /api/consultation/status/{task_id} returns the current processing state. The automated test script test_day8_pipeline.py verified the full flow: upload → HTTP 202 → poll processing → poll completed → receive Urdu text.</w:t>
       </w:r>
     </w:p>
     <w:p>
       <w:pPr>
-        <w:spacing w:before="240" w:after="80"/>
+        <w:spacing w:before="200" w:after="60"/>
         <w:jc w:val="center"/>
       </w:pPr>
       <w:r>
         <w:drawing>
           <wp:inline xmlns:a="http://schemas.openxmlformats.org/drawingml/2006/main" xmlns:pic="http://schemas.openxmlformats.org/drawingml/2006/picture">
-            <wp:extent cx="5303520" cy="2710688"/>
+            <wp:extent cx="5303520" cy="2239264"/>
             <wp:docPr id="6" name="Picture 6"/>
             <wp:cNvGraphicFramePr>
               <a:graphicFrameLocks noChangeAspect="1"/>
@@ -961,7 +949,7 @@
                   <pic:spPr>
                     <a:xfrm>
                       <a:off x="0" y="0"/>
-                      <a:ext cx="5303520" cy="2710688"/>
+                      <a:ext cx="5303520" cy="2239264"/>
                     </a:xfrm>
                     <a:prstGeom prst="rect"/>
                   </pic:spPr>
@@ -974,7 +962,7 @@
     </w:p>
     <w:p>
       <w:pPr>
-        <w:spacing w:after="240"/>
+        <w:spacing w:after="200"/>
         <w:jc w:val="center"/>
       </w:pPr>
       <w:r>
@@ -984,12 +972,12 @@
           <w:color w:val="64748B"/>
           <w:sz w:val="19"/>
         </w:rPr>
-        <w:t>Figure 6: Verified Terminal Output Screenshot showing Async Upload (HTTP 202), Task ID Polling, and Final Transcribed Text Output</w:t>
+        <w:t>Figure 6: test_day8_pipeline.py output showing HTTP 202 upload, polling, and final transcription</w:t>
       </w:r>
     </w:p>
     <w:p>
       <w:pPr>
-        <w:spacing w:before="240" w:after="80"/>
+        <w:spacing w:before="200" w:after="60"/>
         <w:jc w:val="center"/>
       </w:pPr>
       <w:r>
@@ -1029,7 +1017,7 @@
     </w:p>
     <w:p>
       <w:pPr>
-        <w:spacing w:after="240"/>
+        <w:spacing w:after="200"/>
         <w:jc w:val="center"/>
       </w:pPr>
       <w:r>
@@ -1039,7 +1027,7 @@
           <w:color w:val="64748B"/>
           <w:sz w:val="19"/>
         </w:rPr>
-        <w:t>Figure 7: Interactive FastAPI Swagger OpenAPI Polling UI (http://localhost:8000/docs) displaying GET /status/{task_id} Completed Response</w:t>
+        <w:t>Figure 7: FastAPI Swagger UI (http://localhost:8000/docs) showing GET /status/{task_id} completed response</w:t>
       </w:r>
     </w:p>
     <w:p>
@@ -1053,12 +1041,12 @@
           <w:color w:val="0F172A"/>
           <w:sz w:val="36"/>
         </w:rPr>
-        <w:t>Sequential Roadmap for Days 9 to 10</w:t>
+        <w:t>Day 9 Implementation: Frontend Live Transcription Stream Integration</w:t>
       </w:r>
     </w:p>
     <w:p>
       <w:pPr>
-        <w:spacing w:before="280" w:after="120"/>
+        <w:spacing w:before="240" w:after="100"/>
       </w:pPr>
       <w:r>
         <w:rPr>
@@ -1067,7 +1055,7 @@
           <w:color w:val="0D9488"/>
           <w:sz w:val="26"/>
         </w:rPr>
-        <w:t>Day 9 Roadmap: Frontend Live Transcription Stream Integration</w:t>
+        <w:t>Next.js → FastAPI Fetch Integration</w:t>
       </w:r>
     </w:p>
     <w:p>
@@ -1077,17 +1065,16 @@
       <w:r>
         <w:rPr>
           <w:rFonts w:ascii="Calibri" w:hAnsi="Calibri"/>
-          <w:b w:val="0"/>
-          <w:i/>
+          <w:i w:val="0"/>
           <w:color w:val="1E293B"/>
           <w:sz w:val="22"/>
         </w:rPr>
-        <w:t>[Pending Day 9 Implementation: Connecting the Next.js Doctor Consult Screen UI to receive real-time transcription buffers and update EHR preview cards.]</w:t>
+        <w:t>ConsultationRecorder.tsx was updated so that when the MediaRecorder onstop event fires, the assembled WebM Blob is immediately packaged into a FormData object and posted via the fetch API to http://localhost:8000/api/consultation/upload-audio.</w:t>
       </w:r>
     </w:p>
     <w:p>
       <w:pPr>
-        <w:spacing w:before="280" w:after="120"/>
+        <w:spacing w:before="240" w:after="100"/>
       </w:pPr>
       <w:r>
         <w:rPr>
@@ -1096,7 +1083,7 @@
           <w:color w:val="0D9488"/>
           <w:sz w:val="26"/>
         </w:rPr>
-        <w:t>Day 10 Roadmap: Sprint 2 Final Integration &amp; OPD Trial Simulation</w:t>
+        <w:t>Task ID Extraction &amp; 2-Second Polling Loop</w:t>
       </w:r>
     </w:p>
     <w:p>
@@ -1106,12 +1093,274 @@
       <w:r>
         <w:rPr>
           <w:rFonts w:ascii="Calibri" w:hAnsi="Calibri"/>
-          <w:b w:val="0"/>
+          <w:i w:val="0"/>
+          <w:color w:val="1E293B"/>
+          <w:sz w:val="22"/>
+        </w:rPr>
+        <w:t>The returned task_id is extracted and stored in a React ref. A setInterval polling loop runs every 2 seconds, querying GET /api/consultation/status/{task_id}. Polling stops automatically once status transitions to 'completed' or 'failed', preventing unnecessary background requests.</w:t>
+      </w:r>
+    </w:p>
+    <w:p>
+      <w:pPr>
+        <w:spacing w:before="200" w:after="60"/>
+        <w:jc w:val="center"/>
+      </w:pPr>
+      <w:r>
+        <w:drawing>
+          <wp:inline xmlns:a="http://schemas.openxmlformats.org/drawingml/2006/main" xmlns:pic="http://schemas.openxmlformats.org/drawingml/2006/picture">
+            <wp:extent cx="5303520" cy="2592832"/>
+            <wp:docPr id="8" name="Picture 8"/>
+            <wp:cNvGraphicFramePr>
+              <a:graphicFrameLocks noChangeAspect="1"/>
+            </wp:cNvGraphicFramePr>
+            <a:graphic>
+              <a:graphicData uri="http://schemas.openxmlformats.org/drawingml/2006/picture">
+                <pic:pic>
+                  <pic:nvPicPr>
+                    <pic:cNvPr id="0" name="day9_component_code.png"/>
+                    <pic:cNvPicPr/>
+                  </pic:nvPicPr>
+                  <pic:blipFill>
+                    <a:blip r:embed="rId16"/>
+                    <a:stretch>
+                      <a:fillRect/>
+                    </a:stretch>
+                  </pic:blipFill>
+                  <pic:spPr>
+                    <a:xfrm>
+                      <a:off x="0" y="0"/>
+                      <a:ext cx="5303520" cy="2592832"/>
+                    </a:xfrm>
+                    <a:prstGeom prst="rect"/>
+                  </pic:spPr>
+                </pic:pic>
+              </a:graphicData>
+            </a:graphic>
+          </wp:inline>
+        </w:drawing>
+      </w:r>
+    </w:p>
+    <w:p>
+      <w:pPr>
+        <w:spacing w:after="200"/>
+        <w:jc w:val="center"/>
+      </w:pPr>
+      <w:r>
+        <w:rPr>
+          <w:rFonts w:ascii="Calibri" w:hAnsi="Calibri"/>
+          <w:i/>
+          <w:color w:val="64748B"/>
+          <w:sz w:val="19"/>
+        </w:rPr>
+        <w:t>Figure 8: uploadAndTranscribe() in ConsultationRecorder.tsx — FormData upload, task_id extraction, and setInterval polling</w:t>
+      </w:r>
+    </w:p>
+    <w:p>
+      <w:pPr>
+        <w:spacing w:before="240" w:after="100"/>
+      </w:pPr>
+      <w:r>
+        <w:rPr>
+          <w:rFonts w:ascii="Calibri" w:hAnsi="Calibri"/>
+          <w:b/>
+          <w:color w:val="0D9488"/>
+          <w:sz w:val="26"/>
+        </w:rPr>
+        <w:t>Dual UI Status Display</w:t>
+      </w:r>
+    </w:p>
+    <w:p>
+      <w:pPr>
+        <w:spacing w:after="120" w:line="276" w:lineRule="auto"/>
+      </w:pPr>
+      <w:r>
+        <w:rPr>
+          <w:rFonts w:ascii="Calibri" w:hAnsi="Calibri"/>
+          <w:i w:val="0"/>
+          <w:color w:val="1E293B"/>
+          <w:sz w:val="22"/>
+        </w:rPr>
+        <w:t>A real-time status indicator panel renders four states below the recorder button: (1) Uploading Audio — blue animated dots, (2) Processing AI Transcription — amber spinner and indeterminate progress bar, (3) Transcription Complete — read-only textarea with Copy button showing the final Urdu text, (4) Failed — red error message with dismiss option. The bottom EHR panels synchronise with the same transcription state.</w:t>
+      </w:r>
+    </w:p>
+    <w:p>
+      <w:pPr>
+        <w:spacing w:before="200" w:after="60"/>
+        <w:jc w:val="center"/>
+      </w:pPr>
+      <w:r>
+        <w:drawing>
+          <wp:inline xmlns:a="http://schemas.openxmlformats.org/drawingml/2006/main" xmlns:pic="http://schemas.openxmlformats.org/drawingml/2006/picture">
+            <wp:extent cx="5303520" cy="2960104"/>
+            <wp:docPr id="9" name="Picture 9"/>
+            <wp:cNvGraphicFramePr>
+              <a:graphicFrameLocks noChangeAspect="1"/>
+            </wp:cNvGraphicFramePr>
+            <a:graphic>
+              <a:graphicData uri="http://schemas.openxmlformats.org/drawingml/2006/picture">
+                <pic:pic>
+                  <pic:nvPicPr>
+                    <pic:cNvPr id="0" name="day9_ui_uploading_1786531316219.jpg"/>
+                    <pic:cNvPicPr/>
+                  </pic:nvPicPr>
+                  <pic:blipFill>
+                    <a:blip r:embed="rId17"/>
+                    <a:stretch>
+                      <a:fillRect/>
+                    </a:stretch>
+                  </pic:blipFill>
+                  <pic:spPr>
+                    <a:xfrm>
+                      <a:off x="0" y="0"/>
+                      <a:ext cx="5303520" cy="2960104"/>
+                    </a:xfrm>
+                    <a:prstGeom prst="rect"/>
+                  </pic:spPr>
+                </pic:pic>
+              </a:graphicData>
+            </a:graphic>
+          </wp:inline>
+        </w:drawing>
+      </w:r>
+    </w:p>
+    <w:p>
+      <w:pPr>
+        <w:spacing w:after="200"/>
+        <w:jc w:val="center"/>
+      </w:pPr>
+      <w:r>
+        <w:rPr>
+          <w:rFonts w:ascii="Calibri" w:hAnsi="Calibri"/>
+          <w:i/>
+          <w:color w:val="64748B"/>
+          <w:sz w:val="19"/>
+        </w:rPr>
+        <w:t>Figure 9: UI in 'Uploading Audio...' state — audio blob being sent to FastAPI Whisper pipeline</w:t>
+      </w:r>
+    </w:p>
+    <w:p>
+      <w:pPr>
+        <w:spacing w:before="200" w:after="60"/>
+        <w:jc w:val="center"/>
+      </w:pPr>
+      <w:r>
+        <w:drawing>
+          <wp:inline xmlns:a="http://schemas.openxmlformats.org/drawingml/2006/main" xmlns:pic="http://schemas.openxmlformats.org/drawingml/2006/picture">
+            <wp:extent cx="5303520" cy="2960104"/>
+            <wp:docPr id="10" name="Picture 10"/>
+            <wp:cNvGraphicFramePr>
+              <a:graphicFrameLocks noChangeAspect="1"/>
+            </wp:cNvGraphicFramePr>
+            <a:graphic>
+              <a:graphicData uri="http://schemas.openxmlformats.org/drawingml/2006/picture">
+                <pic:pic>
+                  <pic:nvPicPr>
+                    <pic:cNvPr id="0" name="day9_ui_completed_1786531342101.jpg"/>
+                    <pic:cNvPicPr/>
+                  </pic:nvPicPr>
+                  <pic:blipFill>
+                    <a:blip r:embed="rId18"/>
+                    <a:stretch>
+                      <a:fillRect/>
+                    </a:stretch>
+                  </pic:blipFill>
+                  <pic:spPr>
+                    <a:xfrm>
+                      <a:off x="0" y="0"/>
+                      <a:ext cx="5303520" cy="2960104"/>
+                    </a:xfrm>
+                    <a:prstGeom prst="rect"/>
+                  </pic:spPr>
+                </pic:pic>
+              </a:graphicData>
+            </a:graphic>
+          </wp:inline>
+        </w:drawing>
+      </w:r>
+    </w:p>
+    <w:p>
+      <w:pPr>
+        <w:spacing w:after="200"/>
+        <w:jc w:val="center"/>
+      </w:pPr>
+      <w:r>
+        <w:rPr>
+          <w:rFonts w:ascii="Calibri" w:hAnsi="Calibri"/>
+          <w:i/>
+          <w:color w:val="64748B"/>
+          <w:sz w:val="19"/>
+        </w:rPr>
+        <w:t>Figure 10: UI in 'Transcription Complete' state — Urdu transcription displayed in read-only textarea with Copy button</w:t>
+      </w:r>
+    </w:p>
+    <w:p>
+      <w:pPr>
+        <w:spacing w:before="240" w:after="100"/>
+      </w:pPr>
+      <w:r>
+        <w:rPr>
+          <w:rFonts w:ascii="Calibri" w:hAnsi="Calibri"/>
+          <w:b/>
+          <w:color w:val="0D9488"/>
+          <w:sz w:val="26"/>
+        </w:rPr>
+        <w:t>Transcription Quality Improvements (Day 9 Fix)</w:t>
+      </w:r>
+    </w:p>
+    <w:p>
+      <w:pPr>
+        <w:spacing w:after="120" w:line="276" w:lineRule="auto"/>
+      </w:pPr>
+      <w:r>
+        <w:rPr>
+          <w:rFonts w:ascii="Calibri" w:hAnsi="Calibri"/>
+          <w:i w:val="0"/>
+          <w:color w:val="1E293B"/>
+          <w:sz w:val="22"/>
+        </w:rPr>
+        <w:t>Whisper short-clip truncation was resolved by zero-padding all recordings shorter than 30 seconds to the full 480,000-sample Whisper window before building the log-mel spectrogram. Beam search was enabled (num_beams=5) and greedy temperature=0.0 set for more deterministic, higher-accuracy decoding. The silence trimming threshold was also raised from top_db=20 to top_db=30 to prevent quiet speech from being accidentally clipped.</w:t>
+      </w:r>
+    </w:p>
+    <w:p>
+      <w:pPr>
+        <w:spacing w:before="360" w:after="160"/>
+      </w:pPr>
+      <w:r>
+        <w:rPr>
+          <w:rFonts w:ascii="Calibri" w:hAnsi="Calibri"/>
+          <w:b/>
+          <w:color w:val="0F172A"/>
+          <w:sz w:val="36"/>
+        </w:rPr>
+        <w:t>Roadmap for Day 10</w:t>
+      </w:r>
+    </w:p>
+    <w:p>
+      <w:pPr>
+        <w:spacing w:before="240" w:after="100"/>
+      </w:pPr>
+      <w:r>
+        <w:rPr>
+          <w:rFonts w:ascii="Calibri" w:hAnsi="Calibri"/>
+          <w:b/>
+          <w:color w:val="0D9488"/>
+          <w:sz w:val="26"/>
+        </w:rPr>
+        <w:t>Day 10: Sprint 2 Final Integration &amp; OPD Trial Simulation</w:t>
+      </w:r>
+    </w:p>
+    <w:p>
+      <w:pPr>
+        <w:spacing w:after="120" w:line="276" w:lineRule="auto"/>
+      </w:pPr>
+      <w:r>
+        <w:rPr>
+          <w:rFonts w:ascii="Calibri" w:hAnsi="Calibri"/>
           <w:i/>
           <w:color w:val="1E293B"/>
           <w:sz w:val="22"/>
         </w:rPr>
-        <w:t>[Pending Day 10 Implementation: End-to-end OPD consultation workflow trial, error handling, performance benchmark, and supervisor sign-off.]</w:t>
+        <w:t>[Pending: End-to-end OPD consultation workflow trial, ICD-10 NLP entity extraction, error handling hardening, and supervisor sign-off.]</w:t>
       </w:r>
     </w:p>
     <w:p>
@@ -1135,19 +1384,17 @@
       <w:r>
         <w:rPr>
           <w:rFonts w:ascii="Calibri" w:hAnsi="Calibri"/>
-          <w:b w:val="0"/>
           <w:i w:val="0"/>
           <w:color w:val="1E293B"/>
           <w:sz w:val="22"/>
         </w:rPr>
-        <w:t>This section is reserved for supervisor evaluation, comments, and formal sign-off for the Week 2 Technical Progress of ShifaScribe.</w:t>
+        <w:t>This section is reserved for supervisor evaluation and formal sign-off for Week 2.</w:t>
       </w:r>
     </w:p>
     <w:tbl>
       <w:tblPr>
         <w:tblW w:type="auto" w:w="0"/>
         <w:jc w:val="center"/>
-        <w:tblLayout w:type="fixed"/>
         <w:tblLook w:firstColumn="1" w:firstRow="1" w:lastColumn="0" w:lastRow="0" w:noHBand="0" w:noVBand="1" w:val="04A0"/>
       </w:tblPr>
       <w:tblGrid>
@@ -1221,7 +1468,7 @@
               <w:rPr>
                 <w:b/>
               </w:rPr>
-              <w:t>Supervisor Remarks &amp; Feedback:</w:t>
+              <w:t>Supervisor Remarks:</w:t>
             </w:r>
           </w:p>
         </w:tc>
@@ -1230,15 +1477,12 @@
             <w:tcW w:type="dxa" w:w="5904"/>
           </w:tcPr>
           <w:p>
-            <w:pPr>
-              <w:spacing w:after="800"/>
-            </w:pPr>
             <w:r>
               <w:rPr>
                 <w:i/>
                 <w:color w:val="64748B"/>
               </w:rPr>
-              <w:t>(Please write supervisor remarks and evaluation notes here...)</w:t>
+              <w:t>(Please write remarks here...)</w:t>
               <w:br/>
               <w:br/>
               <w:br/>
@@ -1284,7 +1528,7 @@
               <w:rPr>
                 <w:b/>
               </w:rPr>
-              <w:t>Date of Sign-off &amp; Status:</w:t>
+              <w:t>Date of Sign-off:</w:t>
             </w:r>
           </w:p>
         </w:tc>
@@ -1294,7 +1538,7 @@
           </w:tcPr>
           <w:p>
             <w:r>
-              <w:t>Date: ______________, 2026   |   Status: [   ] APPROVED FOR NEXT PHASE</w:t>
+              <w:t>Date: ______________, 2026   |   Status: [   ] APPROVED</w:t>
             </w:r>
           </w:p>
         </w:tc>

</xml_diff>